<commit_message>
Fix agenda 201 talk 04 screenshots to match accurate timeline
Replace mis-attributed embodied-AI frames with in-range ACK data
flywheel / workflow evidence; keep refined timeline.json.

Co-authored-by: Annie <Annie-Summer@users.noreply.github.com>
</commit_message>
<xml_diff>
--- a/yunqi-2026-agenda-201/docs/04-以ACK为底座的开放产线与数据飞轮-华相.docx
+++ b/yunqi-2026-agenda-201/docs/04-以ACK为底座的开放产线与数据飞轮-华相.docx
@@ -77,7 +77,7 @@
           <w:b w:val="0"/>
           <w:sz w:val="22"/>
         </w:rPr>
-        <w:t>本场围绕 ACK 托管底座上的开放 AI 产线：全托管容器 Argo 工作流集群承担大规模离线数据与科学计算编排，相对开源自建宣称约 30% 资源成本节省与 10 倍规模提升；Argo 原生纳管 RayCluster 生命周期，打通数据收集→Spark→Ray→PyTorch→归档的流水线；Ray on ACK 面向大模型/具身/自动驾驶等分布式计算，给出万级 Pod 秒级扩容与单集群海量 RayCluster 并发指标，并以具身智能场景说明从 VLA 到 WAM、Real2Sim2Real 数据飞轮对「敏捷 Infra」的结构性要求。</w:t>
+        <w:t>本场围绕 ACK 托管底座上的开放 AI 数据产线：以「数据闭环天然是工作流」为起点，用全托管容器 Argo 工作流集群编排大规模离线数据与科学计算（相对开源自建宣称约 30% 资源成本节省、规模约 10×）；Argo 原生纳管 RayCluster 生命周期，打通数据收集→Spark→Ray→PyTorch→归档；Ray on ACK 面向大模型/具身/智驾等分布式计算，给出万级 Pod 秒级扩容与单集群海量 RayCluster 并发指标。</w:t>
       </w:r>
     </w:p>
     <w:p>
@@ -680,7 +680,7 @@
           <w:b/>
           <w:sz w:val="26"/>
         </w:rPr>
-        <w:t>4. 开放产线垂直场景：从 VLA 到 WAM 的数据飞轮</w:t>
+        <w:t>4. 数据闭环：天然的工作流模式</w:t>
       </w:r>
     </w:p>
     <w:p>
@@ -707,7 +707,7 @@
           <w:b w:val="0"/>
           <w:sz w:val="22"/>
         </w:rPr>
-        <w:t>主线：从「见即行」的 VLA 升级为「先预测再行动」的 WAM（World-Action Model），内置物理仿真对长尾方案推演择优。</w:t>
+        <w:t>以智驾/具身类场景为例：直采车/主机厂多传感器采集 → 回传与仿真数据汇入数据管理平台（本地+云端存储）→ 处理/挖掘 → 自动+人工标注 → 数据集管理 → 训练与迭代优化。</w:t>
       </w:r>
     </w:p>
     <w:p>
@@ -721,7 +721,7 @@
           <w:b w:val="0"/>
           <w:sz w:val="22"/>
         </w:rPr>
-        <w:t>跨本体统一：策略与硬件解耦，数据与训练资产跨本体复用，训评不再绑定单一机型。</w:t>
+        <w:t>下游接仿真平台：SIL/HIL/DIL/VIL 等在环测试，配套场景库、模型技术、测试工具与评估体系；优化后再部署回流，形成闭环。</w:t>
       </w:r>
     </w:p>
     <w:p>
@@ -735,7 +735,7 @@
           <w:b w:val="0"/>
           <w:sz w:val="22"/>
         </w:rPr>
-        <w:t>Real2Sim2Real：互联网视频学技能 + 真机与仿真双向回流，长尾场景在仿真量产复现再回真机验证，形成可累积的数据与场景资产。</w:t>
+        <w:t>底座治理横切：合规、采集确权、分类分级、脱敏加密、共享与跨境，决定产线能否进生产。</w:t>
       </w:r>
     </w:p>
     <w:p>
@@ -762,7 +762,7 @@
           <w:b w:val="0"/>
           <w:sz w:val="22"/>
         </w:rPr>
-        <w:t>范式：感知-预测-行动闭环</w:t>
+        <w:t>闭环环节：采集→标注→训练→多形态在环仿真→部署回流</w:t>
       </w:r>
     </w:p>
     <w:p>
@@ -776,7 +776,7 @@
           <w:b w:val="0"/>
           <w:sz w:val="22"/>
         </w:rPr>
-        <w:t>飞轮：视频学习 + 仿真闭环资产沉淀</w:t>
+        <w:t>存储形态：本地存储 + 云端存储统一进入数据管理平台</w:t>
       </w:r>
     </w:p>
     <w:p>
@@ -795,7 +795,7 @@
               <a:graphicData uri="http://schemas.openxmlformats.org/drawingml/2006/picture">
                 <pic:pic>
                   <pic:nvPicPr>
-                    <pic:cNvPr id="0" name="t01-27-00.png"/>
+                    <pic:cNvPr id="0" name="t01-16-00.png"/>
                     <pic:cNvPicPr/>
                   </pic:nvPicPr>
                   <pic:blipFill>
@@ -829,7 +829,7 @@
           <w:color w:val="5A5A5A"/>
           <w:sz w:val="18"/>
         </w:rPr>
-        <w:t>图示佐证：开放产线垂直场景：从 VLA 到 WAM 的数据飞轮（t01-27-00.png）</w:t>
+        <w:t>图示佐证：数据闭环：天然的工作流模式（t01-16-00.png）</w:t>
       </w:r>
     </w:p>
     <w:p>
@@ -855,7 +855,7 @@
           <w:b w:val="0"/>
           <w:sz w:val="22"/>
         </w:rPr>
-        <w:t>ACK 开放产线不能停在通用 MLOps：HCS 面向具身/智驾行业包应预置仿真集群、跨本体数据集与 Real2Sim 回流工作流模板，把「数据飞轮」做成可交付行业解决方案而非单点训练作业。</w:t>
+        <w:t>HCS 开放产线规划要以「工作流化数据闭环」为产品骨架，而不是散装大数据组件；政企交付需默认带齐分类分级、脱敏与跨境治理能力，否则飞轮停在实验室。</w:t>
       </w:r>
     </w:p>
     <w:p>
@@ -868,7 +868,7 @@
           <w:b/>
           <w:sz w:val="26"/>
         </w:rPr>
-        <w:t>5. 敏捷基础设施：训仿推一体与 RoboOps</w:t>
+        <w:t>5. 为什么需要工作流引擎</w:t>
       </w:r>
     </w:p>
     <w:p>
@@ -895,7 +895,7 @@
           <w:b w:val="0"/>
           <w:sz w:val="22"/>
         </w:rPr>
-        <w:t>四个结构性迁移：算力从训练集群→训/仿/推一体调度；数据从静态集→成败皆回流的经验飞轮；架构从云中心→云边端分层自治；运维从 MLOps→RoboOps（模型+策略+本体）。</w:t>
+        <w:t>复杂产线（如 Kubeflow/TF-Serving 类 CI 流水）需要：任务串行、中间数据传递、并发度配置、调度与失败重试。</w:t>
       </w:r>
     </w:p>
     <w:p>
@@ -909,7 +909,7 @@
           <w:b w:val="0"/>
           <w:sz w:val="22"/>
         </w:rPr>
-        <w:t>演进：短期平台化（共享数据湖+GPU 池、统一仿真/评测/模型仓）；中期规模化（多机训练+云边协同、OTA/金丝雀回滚）；远期自治化（世界模型+持续学习、跨本体迁移/自主数据闭环）。</w:t>
+        <w:t>工作流引擎把「人盯脚本」升级为可观测、可重试、可并行的编排资产，是数据飞轮规模化的控制面。</w:t>
       </w:r>
     </w:p>
     <w:p>
@@ -923,7 +923,7 @@
           <w:b w:val="0"/>
           <w:sz w:val="22"/>
         </w:rPr>
-        <w:t>选型优先级：数据闭环效率、仿真吞吐与保真、端到端时延/能效、跨本体可迁移、安全可回溯；原则是先建「数据-训练-仿真-部署-回流」最小闭环再按机器与场景扩。</w:t>
+        <w:t>与托管 Argo 形成因果链：先有工作流范式，再有 ACK 上的全托管执行底座。</w:t>
       </w:r>
     </w:p>
     <w:p>
@@ -950,21 +950,7 @@
           <w:b w:val="0"/>
           <w:sz w:val="22"/>
         </w:rPr>
-        <w:t>建设原则：先最小闭环，再按机器人数量与场景复杂度扩展</w:t>
-      </w:r>
-    </w:p>
-    <w:p>
-      <w:pPr>
-        <w:pStyle w:val="ListBullet"/>
-        <w:spacing w:after="60"/>
-      </w:pPr>
-      <w:r>
-        <w:rPr>
-          <w:rFonts w:ascii="微软雅黑" w:hAnsi="微软雅黑" w:eastAsia="微软雅黑"/>
-          <w:b w:val="0"/>
-          <w:sz w:val="22"/>
-        </w:rPr>
-        <w:t>中期目标：千台级机群运营效率</w:t>
+        <w:t>引擎五能力：串联、传数、并发、调度、失败重试</w:t>
       </w:r>
     </w:p>
     <w:p>
@@ -983,7 +969,7 @@
               <a:graphicData uri="http://schemas.openxmlformats.org/drawingml/2006/picture">
                 <pic:pic>
                   <pic:nvPicPr>
-                    <pic:cNvPr id="0" name="t01-28-30.png"/>
+                    <pic:cNvPr id="0" name="t01-18-00.png"/>
                     <pic:cNvPicPr/>
                   </pic:nvPicPr>
                   <pic:blipFill>
@@ -1017,7 +1003,7 @@
           <w:color w:val="5A5A5A"/>
           <w:sz w:val="18"/>
         </w:rPr>
-        <w:t>图示佐证：敏捷基础设施：训仿推一体与 RoboOps（t01-28-30.png）</w:t>
+        <w:t>图示佐证：为什么需要工作流引擎（t01-18-00.png）</w:t>
       </w:r>
     </w:p>
     <w:p>
@@ -1043,7 +1029,7 @@
           <w:b w:val="0"/>
           <w:sz w:val="22"/>
         </w:rPr>
-        <w:t>HCS 行业规划应单列 RoboOps/具身运维能力（OTA、金丝雀、本体配置）并与 CCE 边缘、GPU 池、数据湖打通；「敏捷」定义为闭环周期与边际场景成本，而不是单纯扩容节点，这与政企专属云交付节奏匹配。</w:t>
+        <w:t>HCS 对标时不要只比 K8s 节点能力，要把「托管工作流引擎 + 对象存储/日志/鉴权一键集成」作为数据产线差异化；这是客户愿意从开源自建迁到专属云平台的关键理由。</w:t>
       </w:r>
     </w:p>
     <w:p>
@@ -1070,7 +1056,7 @@
           <w:b w:val="0"/>
           <w:sz w:val="22"/>
         </w:rPr>
-        <w:t>以托管 Argo + Ray on CCE/ACK 对标建设开放产线底座，用 Serverless 与 GPU 公平调度吃下数据准备与分布式训练峰值。</w:t>
+        <w:t>以托管 Argo（Serverless/节点池混部）+ Ray on CCE/ACK 对标建设开放产线底座，用对象存储缓存与 GPU 公平配额吃下数据准备与分布式计算峰值。</w:t>
       </w:r>
     </w:p>
     <w:p>
@@ -1084,7 +1070,7 @@
           <w:b w:val="0"/>
           <w:sz w:val="22"/>
         </w:rPr>
-        <w:t>将具身/智驾等垂直场景的 Real2Sim2Real 与 WAM 仿真需求沉淀为行业工作流模板，体现 ACK 开放产线的「数据飞轮」价值。</w:t>
+        <w:t>产品叙事对齐「数据闭环=工作流」：采集—标注—训练—在环仿真—回流要有一站式模板，并把合规治理做成默认横切能力。</w:t>
       </w:r>
     </w:p>
     <w:p>
@@ -1098,7 +1084,7 @@
           <w:b w:val="0"/>
           <w:sz w:val="22"/>
         </w:rPr>
-        <w:t>把训仿推一体调度、云边端分层与 RoboOps 写入 HCS 中长期 Infra 路线，避免 AI 平台停留在静态数据集 + 中心训练的旧范式。</w:t>
+        <w:t>将「30s 万 Pod、单集群数万 RayCluster、万级并发工作流」写入 HCS 调度与控制面压测目标，作为与公有云 ACK 对标的硬指标。</w:t>
       </w:r>
     </w:p>
     <w:p>

</xml_diff>